<commit_message>
updated message and cv
</commit_message>
<xml_diff>
--- a/Arham_Yunus_Awan_CV.docx
+++ b/Arham_Yunus_Awan_CV.docx
@@ -98,7 +98,7 @@
           </w:tcPr>
           <w:p>
             <w:pPr>
-              <w:spacing w:after="20"/>
+              <w:spacing w:after="0"/>
             </w:pPr>
             <w:r>
               <w:rPr>
@@ -114,7 +114,7 @@
           </w:p>
           <w:p>
             <w:pPr>
-              <w:spacing w:after="20"/>
+              <w:spacing w:after="0"/>
             </w:pPr>
             <w:r>
               <w:rPr>
@@ -216,7 +216,7 @@
         <w:pBdr>
           <w:bottom w:val="single" w:color="0077AA" w:sz="2" w:space="4"/>
         </w:pBdr>
-        <w:spacing w:before="140" w:after="40"/>
+        <w:spacing w:before="80" w:after="20"/>
       </w:pPr>
       <w:r>
         <w:rPr>
@@ -232,7 +232,7 @@
     </w:p>
     <w:p>
       <w:pPr>
-        <w:spacing w:after="60"/>
+        <w:spacing w:after="20"/>
       </w:pPr>
       <w:r>
         <w:rPr>
@@ -249,7 +249,7 @@
         <w:pBdr>
           <w:bottom w:val="single" w:color="0077AA" w:sz="2" w:space="4"/>
         </w:pBdr>
-        <w:spacing w:before="140" w:after="40"/>
+        <w:spacing w:before="80" w:after="20"/>
       </w:pPr>
       <w:r>
         <w:rPr>
@@ -265,7 +265,7 @@
     </w:p>
     <w:p>
       <w:pPr>
-        <w:spacing w:before="100" w:after="0"/>
+        <w:spacing w:before="60" w:after="0"/>
       </w:pPr>
       <w:r>
         <w:rPr>
@@ -309,16 +309,16 @@
           <w:ilvl w:val="0"/>
           <w:numId w:val="2"/>
         </w:numPr>
-        <w:spacing w:after="20"/>
-      </w:pPr>
-      <w:r>
-        <w:rPr>
-          <w:rFonts w:ascii="Arial" w:cs="Arial" w:eastAsia="Arial" w:hAnsi="Arial"/>
-          <w:color w:val="1A1A2E"/>
-          <w:sz w:val="18"/>
-          <w:szCs w:val="18"/>
-        </w:rPr>
-        <w:t xml:space="preserve">Develop and optimize AWS serverless solutions using Lambda, DynamoDB, API Gateway, and S3 for production environments</w:t>
+        <w:spacing w:after="0"/>
+      </w:pPr>
+      <w:r>
+        <w:rPr>
+          <w:rFonts w:ascii="Arial" w:cs="Arial" w:eastAsia="Arial" w:hAnsi="Arial"/>
+          <w:color w:val="1A1A2E"/>
+          <w:sz w:val="18"/>
+          <w:szCs w:val="18"/>
+        </w:rPr>
+        <w:t xml:space="preserve">Built and deployed a full Genesys SMS survey platform with voice integration, DynamoDB backend, and QuickSight analytics dashboards for real-time client reporting</w:t>
       </w:r>
     </w:p>
     <w:p>
@@ -328,16 +328,16 @@
           <w:ilvl w:val="0"/>
           <w:numId w:val="2"/>
         </w:numPr>
-        <w:spacing w:after="20"/>
-      </w:pPr>
-      <w:r>
-        <w:rPr>
-          <w:rFonts w:ascii="Arial" w:cs="Arial" w:eastAsia="Arial" w:hAnsi="Arial"/>
-          <w:color w:val="1A1A2E"/>
-          <w:sz w:val="18"/>
-          <w:szCs w:val="18"/>
-        </w:rPr>
-        <w:t xml:space="preserve">Integrate Genesys Cloud APIs with AWS services for real-time contact center automation and workflows</w:t>
+        <w:spacing w:after="0"/>
+      </w:pPr>
+      <w:r>
+        <w:rPr>
+          <w:rFonts w:ascii="Arial" w:cs="Arial" w:eastAsia="Arial" w:hAnsi="Arial"/>
+          <w:color w:val="1A1A2E"/>
+          <w:sz w:val="18"/>
+          <w:szCs w:val="18"/>
+        </w:rPr>
+        <w:t xml:space="preserve">Architected and maintained a hierarchical S3 data lakehouse pipeline using AWS Glue and Athena, enabling scalable business intelligence across client datasets</w:t>
       </w:r>
     </w:p>
     <w:p>
@@ -347,16 +347,16 @@
           <w:ilvl w:val="0"/>
           <w:numId w:val="2"/>
         </w:numPr>
-        <w:spacing w:after="20"/>
-      </w:pPr>
-      <w:r>
-        <w:rPr>
-          <w:rFonts w:ascii="Arial" w:cs="Arial" w:eastAsia="Arial" w:hAnsi="Arial"/>
-          <w:color w:val="1A1A2E"/>
-          <w:sz w:val="18"/>
-          <w:szCs w:val="18"/>
-        </w:rPr>
-        <w:t xml:space="preserve">Build and maintain cloud data pipelines using AWS Athena and Glue for business analytics</w:t>
+        <w:spacing w:after="0"/>
+      </w:pPr>
+      <w:r>
+        <w:rPr>
+          <w:rFonts w:ascii="Arial" w:cs="Arial" w:eastAsia="Arial" w:hAnsi="Arial"/>
+          <w:color w:val="1A1A2E"/>
+          <w:sz w:val="18"/>
+          <w:szCs w:val="18"/>
+        </w:rPr>
+        <w:t xml:space="preserve">Developed a GPS location sharing web application integrated with Genesys Cloud for real-time agent and field operations tracking</w:t>
       </w:r>
     </w:p>
     <w:p>
@@ -366,16 +366,16 @@
           <w:ilvl w:val="0"/>
           <w:numId w:val="2"/>
         </w:numPr>
-        <w:spacing w:after="20"/>
-      </w:pPr>
-      <w:r>
-        <w:rPr>
-          <w:rFonts w:ascii="Arial" w:cs="Arial" w:eastAsia="Arial" w:hAnsi="Arial"/>
-          <w:color w:val="1A1A2E"/>
-          <w:sz w:val="18"/>
-          <w:szCs w:val="18"/>
-        </w:rPr>
-        <w:t xml:space="preserve">Develop web applications and interfaces supporting Genesys Cloud integrations</w:t>
+        <w:spacing w:after="0"/>
+      </w:pPr>
+      <w:r>
+        <w:rPr>
+          <w:rFonts w:ascii="Arial" w:cs="Arial" w:eastAsia="Arial" w:hAnsi="Arial"/>
+          <w:color w:val="1A1A2E"/>
+          <w:sz w:val="18"/>
+          <w:szCs w:val="18"/>
+        </w:rPr>
+        <w:t xml:space="preserve">Built a custom iCarol-alternative web application handling case management workflows with Genesys Cloud integration</w:t>
       </w:r>
     </w:p>
     <w:p>
@@ -385,16 +385,16 @@
           <w:ilvl w:val="0"/>
           <w:numId w:val="2"/>
         </w:numPr>
-        <w:spacing w:after="20"/>
-      </w:pPr>
-      <w:r>
-        <w:rPr>
-          <w:rFonts w:ascii="Arial" w:cs="Arial" w:eastAsia="Arial" w:hAnsi="Arial"/>
-          <w:color w:val="1A1A2E"/>
-          <w:sz w:val="18"/>
-          <w:szCs w:val="18"/>
-        </w:rPr>
-        <w:t xml:space="preserve">Automate API-driven workflows improving operational efficiency across client systems</w:t>
+        <w:spacing w:after="0"/>
+      </w:pPr>
+      <w:r>
+        <w:rPr>
+          <w:rFonts w:ascii="Arial" w:cs="Arial" w:eastAsia="Arial" w:hAnsi="Arial"/>
+          <w:color w:val="1A1A2E"/>
+          <w:sz w:val="18"/>
+          <w:szCs w:val="18"/>
+        </w:rPr>
+        <w:t xml:space="preserve">Engineered AWS serverless backends using Lambda, API Gateway, DynamoDB, and S3 for multiple production client environments</w:t>
       </w:r>
     </w:p>
     <w:p>
@@ -404,21 +404,59 @@
           <w:ilvl w:val="0"/>
           <w:numId w:val="2"/>
         </w:numPr>
-        <w:spacing w:after="20"/>
-      </w:pPr>
-      <w:r>
-        <w:rPr>
-          <w:rFonts w:ascii="Arial" w:cs="Arial" w:eastAsia="Arial" w:hAnsi="Arial"/>
-          <w:color w:val="1A1A2E"/>
-          <w:sz w:val="18"/>
-          <w:szCs w:val="18"/>
-        </w:rPr>
-        <w:t xml:space="preserve">Implement cloud security best practices for high-traffic production applications</w:t>
-      </w:r>
-    </w:p>
-    <w:p>
-      <w:pPr>
-        <w:spacing w:before="100" w:after="0"/>
+        <w:spacing w:after="0"/>
+      </w:pPr>
+      <w:r>
+        <w:rPr>
+          <w:rFonts w:ascii="Arial" w:cs="Arial" w:eastAsia="Arial" w:hAnsi="Arial"/>
+          <w:color w:val="1A1A2E"/>
+          <w:sz w:val="18"/>
+          <w:szCs w:val="18"/>
+        </w:rPr>
+        <w:t xml:space="preserve">Deployed and managed MySQL databases on EC2 with custom server configurations for client-specific data requirements</w:t>
+      </w:r>
+    </w:p>
+    <w:p>
+      <w:pPr>
+        <w:pStyle w:val="ListParagraph"/>
+        <w:numPr>
+          <w:ilvl w:val="0"/>
+          <w:numId w:val="2"/>
+        </w:numPr>
+        <w:spacing w:after="0"/>
+      </w:pPr>
+      <w:r>
+        <w:rPr>
+          <w:rFonts w:ascii="Arial" w:cs="Arial" w:eastAsia="Arial" w:hAnsi="Arial"/>
+          <w:color w:val="1A1A2E"/>
+          <w:sz w:val="18"/>
+          <w:szCs w:val="18"/>
+        </w:rPr>
+        <w:t xml:space="preserve">Automated Genesys Cloud API workflows reducing manual operational overhead across contact center client systems</w:t>
+      </w:r>
+    </w:p>
+    <w:p>
+      <w:pPr>
+        <w:pStyle w:val="ListParagraph"/>
+        <w:numPr>
+          <w:ilvl w:val="0"/>
+          <w:numId w:val="2"/>
+        </w:numPr>
+        <w:spacing w:after="0"/>
+      </w:pPr>
+      <w:r>
+        <w:rPr>
+          <w:rFonts w:ascii="Arial" w:cs="Arial" w:eastAsia="Arial" w:hAnsi="Arial"/>
+          <w:color w:val="1A1A2E"/>
+          <w:sz w:val="18"/>
+          <w:szCs w:val="18"/>
+        </w:rPr>
+        <w:t xml:space="preserve">Implemented cloud security best practices across high-traffic production applications in a fully remote international environment</w:t>
+      </w:r>
+    </w:p>
+    <w:p>
+      <w:pPr>
+        <w:spacing w:before="60" w:after="0"/>
       </w:pPr>
       <w:r>
         <w:rPr>
@@ -462,7 +500,7 @@
           <w:ilvl w:val="0"/>
           <w:numId w:val="3"/>
         </w:numPr>
-        <w:spacing w:after="20"/>
+        <w:spacing w:after="0"/>
       </w:pPr>
       <w:r>
         <w:rPr>
@@ -481,7 +519,7 @@
           <w:ilvl w:val="0"/>
           <w:numId w:val="3"/>
         </w:numPr>
-        <w:spacing w:after="20"/>
+        <w:spacing w:after="0"/>
       </w:pPr>
       <w:r>
         <w:rPr>
@@ -500,7 +538,7 @@
           <w:ilvl w:val="0"/>
           <w:numId w:val="3"/>
         </w:numPr>
-        <w:spacing w:after="20"/>
+        <w:spacing w:after="0"/>
       </w:pPr>
       <w:r>
         <w:rPr>
@@ -517,7 +555,7 @@
         <w:pBdr>
           <w:bottom w:val="single" w:color="0077AA" w:sz="2" w:space="4"/>
         </w:pBdr>
-        <w:spacing w:before="140" w:after="40"/>
+        <w:spacing w:before="80" w:after="20"/>
       </w:pPr>
       <w:r>
         <w:rPr>
@@ -533,7 +571,7 @@
     </w:p>
     <w:p>
       <w:pPr>
-        <w:spacing w:before="60" w:after="30"/>
+        <w:spacing w:before="60" w:after="20"/>
       </w:pPr>
       <w:r>
         <w:rPr>
@@ -558,7 +596,7 @@
     </w:p>
     <w:p>
       <w:pPr>
-        <w:spacing w:after="20"/>
+        <w:spacing w:after="0"/>
       </w:pPr>
       <w:r>
         <w:rPr>
@@ -572,7 +610,7 @@
     </w:p>
     <w:p>
       <w:pPr>
-        <w:spacing w:before="40" w:after="30"/>
+        <w:spacing w:before="40" w:after="20"/>
       </w:pPr>
       <w:r>
         <w:rPr>
@@ -597,7 +635,7 @@
     </w:p>
     <w:p>
       <w:pPr>
-        <w:spacing w:after="20"/>
+        <w:spacing w:after="0"/>
       </w:pPr>
       <w:r>
         <w:rPr>
@@ -611,7 +649,7 @@
     </w:p>
     <w:p>
       <w:pPr>
-        <w:spacing w:before="40" w:after="30"/>
+        <w:spacing w:before="40" w:after="20"/>
       </w:pPr>
       <w:r>
         <w:rPr>
@@ -636,7 +674,7 @@
     </w:p>
     <w:p>
       <w:pPr>
-        <w:spacing w:after="20"/>
+        <w:spacing w:after="0"/>
       </w:pPr>
       <w:r>
         <w:rPr>
@@ -650,7 +688,7 @@
     </w:p>
     <w:p>
       <w:pPr>
-        <w:spacing w:before="40" w:after="30"/>
+        <w:spacing w:before="40" w:after="20"/>
       </w:pPr>
       <w:r>
         <w:rPr>
@@ -675,7 +713,7 @@
     </w:p>
     <w:p>
       <w:pPr>
-        <w:spacing w:after="20"/>
+        <w:spacing w:after="0"/>
       </w:pPr>
       <w:r>
         <w:rPr>
@@ -692,7 +730,7 @@
         <w:pBdr>
           <w:bottom w:val="single" w:color="0077AA" w:sz="2" w:space="4"/>
         </w:pBdr>
-        <w:spacing w:before="140" w:after="40"/>
+        <w:spacing w:before="80" w:after="20"/>
       </w:pPr>
       <w:r>
         <w:rPr>
@@ -708,7 +746,7 @@
     </w:p>
     <w:p>
       <w:pPr>
-        <w:spacing w:after="20"/>
+        <w:spacing w:after="0"/>
       </w:pPr>
       <w:r>
         <w:rPr>
@@ -733,7 +771,7 @@
     </w:p>
     <w:p>
       <w:pPr>
-        <w:spacing w:after="20"/>
+        <w:spacing w:after="0"/>
       </w:pPr>
       <w:r>
         <w:rPr>
@@ -758,7 +796,7 @@
     </w:p>
     <w:p>
       <w:pPr>
-        <w:spacing w:after="20"/>
+        <w:spacing w:after="0"/>
       </w:pPr>
       <w:r>
         <w:rPr>
@@ -783,7 +821,7 @@
     </w:p>
     <w:p>
       <w:pPr>
-        <w:spacing w:after="20"/>
+        <w:spacing w:after="0"/>
       </w:pPr>
       <w:r>
         <w:rPr>
@@ -808,7 +846,7 @@
     </w:p>
     <w:p>
       <w:pPr>
-        <w:spacing w:after="20"/>
+        <w:spacing w:after="0"/>
       </w:pPr>
       <w:r>
         <w:rPr>
@@ -836,7 +874,7 @@
         <w:pBdr>
           <w:bottom w:val="single" w:color="0077AA" w:sz="2" w:space="4"/>
         </w:pBdr>
-        <w:spacing w:before="140" w:after="40"/>
+        <w:spacing w:before="80" w:after="20"/>
       </w:pPr>
       <w:r>
         <w:rPr>
@@ -879,7 +917,7 @@
     </w:p>
     <w:p>
       <w:pPr>
-        <w:spacing w:after="20"/>
+        <w:spacing w:after="0"/>
       </w:pPr>
       <w:r>
         <w:rPr>
@@ -902,7 +940,7 @@
     </w:p>
     <w:p>
       <w:pPr>
-        <w:spacing w:after="20"/>
+        <w:spacing w:after="0"/>
       </w:pPr>
       <w:r>
         <w:rPr>
@@ -941,7 +979,7 @@
     </w:p>
     <w:p>
       <w:pPr>
-        <w:spacing w:after="20"/>
+        <w:spacing w:after="0"/>
       </w:pPr>
       <w:r>
         <w:rPr>
@@ -964,7 +1002,7 @@
     </w:p>
     <w:p>
       <w:pPr>
-        <w:spacing w:after="20"/>
+        <w:spacing w:after="0"/>
       </w:pPr>
       <w:r>
         <w:rPr>
@@ -981,7 +1019,7 @@
         <w:pBdr>
           <w:bottom w:val="single" w:color="0077AA" w:sz="2" w:space="4"/>
         </w:pBdr>
-        <w:spacing w:before="140" w:after="40"/>
+        <w:spacing w:before="80" w:after="20"/>
       </w:pPr>
       <w:r>
         <w:rPr>
@@ -1163,7 +1201,7 @@
     </w:p>
     <w:sectPr>
       <w:pgSz w:w="12240" w:h="15840" w:orient="portrait"/>
-      <w:pgMar w:top="500" w:right="850" w:bottom="400" w:left="850" w:header="708" w:footer="708" w:gutter="0"/>
+      <w:pgMar w:top="360" w:right="850" w:bottom="300" w:left="850" w:header="708" w:footer="708" w:gutter="0"/>
       <w:pgNumType/>
       <w:docGrid w:linePitch="360"/>
     </w:sectPr>

</xml_diff>